<commit_message>
Update AWS to Certified AI Practitioner (completed) across resume + portfolio + AI context
</commit_message>
<xml_diff>
--- a/public/Gaby-Zaynoun-Resume.docx
+++ b/public/Gaby-Zaynoun-Resume.docx
@@ -47,7 +47,7 @@
         </w:rPr>
         <w:t xml:space="preserve">Sydney, Australia  ·  </w:t>
       </w:r>
-      <w:hyperlink w:history="1" r:id="rIdy37lg4yj1yphxakoszus4">
+      <w:hyperlink w:history="1" r:id="rIdekphsib65vkggnjirbncb">
         <w:r>
           <w:rPr>
             <w:rFonts w:ascii="Arial" w:cs="Arial" w:eastAsia="Arial" w:hAnsi="Arial"/>
@@ -64,7 +64,7 @@
         </w:rPr>
         <w:t xml:space="preserve">  ·  </w:t>
       </w:r>
-      <w:hyperlink w:history="1" r:id="rIdsiig2nfpzvwn1fbchsid-">
+      <w:hyperlink w:history="1" r:id="rId8uiwr0wgnlyqeq9dwlgn4">
         <w:r>
           <w:rPr>
             <w:rFonts w:ascii="Arial" w:cs="Arial" w:eastAsia="Arial" w:hAnsi="Arial"/>
@@ -81,7 +81,7 @@
         </w:rPr>
         <w:t xml:space="preserve">  ·  </w:t>
       </w:r>
-      <w:hyperlink w:history="1" r:id="rIdzyk6bvfqp4lkm3hezmgtl">
+      <w:hyperlink w:history="1" r:id="rIdjiildmgl3uc4v3eiift6r">
         <w:r>
           <w:rPr>
             <w:rFonts w:ascii="Arial" w:cs="Arial" w:eastAsia="Arial" w:hAnsi="Arial"/>
@@ -98,7 +98,7 @@
         </w:rPr>
         <w:t xml:space="preserve">  ·  </w:t>
       </w:r>
-      <w:hyperlink w:history="1" r:id="rIdyd764aj7hrmwi4ucs3nyg">
+      <w:hyperlink w:history="1" r:id="rIdnfhpdi4q4bu8g3okzyx38">
         <w:r>
           <w:rPr>
             <w:rFonts w:ascii="Arial" w:cs="Arial" w:eastAsia="Arial" w:hAnsi="Arial"/>
@@ -850,7 +850,7 @@
           <w:rFonts w:ascii="Arial" w:cs="Arial" w:eastAsia="Arial" w:hAnsi="Arial"/>
           <w:color w:val="111111"/>
         </w:rPr>
-        <w:t xml:space="preserve">Azure (hands-on, DevOps CI/CD), Vercel (production), Firebase, Supabase. AWS &amp; GCP — academic, with the VAISS AWS deployment in flight as a hands-on learning project. CI/CD via Azure DevOps and GitHub Actions. Docker basics.</w:t>
+        <w:t xml:space="preserve">Azure (hands-on, DevOps CI/CD), Vercel (production), Firebase, Supabase. AWS — Certified AI Practitioner, with the VAISS AWS deployment in flight as a hands-on learning project. GCP — academic. CI/CD via Azure DevOps and GitHub Actions. Docker basics.</w:t>
       </w:r>
     </w:p>
     <w:p>
@@ -1154,7 +1154,7 @@
           <w:rFonts w:ascii="Arial" w:cs="Arial" w:eastAsia="Arial" w:hAnsi="Arial"/>
           <w:color w:val="111111"/>
         </w:rPr>
-        <w:t xml:space="preserve">AWS AI Practitioner &amp; Solutions Architect Associate — actively studying</w:t>
+        <w:t xml:space="preserve">AWS Certified AI Practitioner (certified) · AWS Solutions Architect Associate — in progress</w:t>
       </w:r>
     </w:p>
     <w:p>

</xml_diff>

<commit_message>
AWS Certified AI Practitioner (completed) (#7)
* Promote project Live/Code links to always-visible, fix nav brand, drop unused AWS skills

* Make claims honest: drop AWS hands-on overclaim, fix Westcon role, remove target companies; add findbytype + Q-Lex links; fix empty-message bug in chat history

* Add project thumbnails, Download Resume button, role badges, resume-accurate bio (4+ years)

* Generate honest, ATS-friendly resume; drop CalcSolve 10k+ marketing claim from portfolio

* Force revalidation on resume download to prevent stale browser cache

* Update AWS to Certified AI Practitioner (completed) across resume + portfolio + AI context
</commit_message>
<xml_diff>
--- a/public/Gaby-Zaynoun-Resume.docx
+++ b/public/Gaby-Zaynoun-Resume.docx
@@ -47,7 +47,7 @@
         </w:rPr>
         <w:t xml:space="preserve">Sydney, Australia  ·  </w:t>
       </w:r>
-      <w:hyperlink w:history="1" r:id="rIdy37lg4yj1yphxakoszus4">
+      <w:hyperlink w:history="1" r:id="rIdekphsib65vkggnjirbncb">
         <w:r>
           <w:rPr>
             <w:rFonts w:ascii="Arial" w:cs="Arial" w:eastAsia="Arial" w:hAnsi="Arial"/>
@@ -64,7 +64,7 @@
         </w:rPr>
         <w:t xml:space="preserve">  ·  </w:t>
       </w:r>
-      <w:hyperlink w:history="1" r:id="rIdsiig2nfpzvwn1fbchsid-">
+      <w:hyperlink w:history="1" r:id="rId8uiwr0wgnlyqeq9dwlgn4">
         <w:r>
           <w:rPr>
             <w:rFonts w:ascii="Arial" w:cs="Arial" w:eastAsia="Arial" w:hAnsi="Arial"/>
@@ -81,7 +81,7 @@
         </w:rPr>
         <w:t xml:space="preserve">  ·  </w:t>
       </w:r>
-      <w:hyperlink w:history="1" r:id="rIdzyk6bvfqp4lkm3hezmgtl">
+      <w:hyperlink w:history="1" r:id="rIdjiildmgl3uc4v3eiift6r">
         <w:r>
           <w:rPr>
             <w:rFonts w:ascii="Arial" w:cs="Arial" w:eastAsia="Arial" w:hAnsi="Arial"/>
@@ -98,7 +98,7 @@
         </w:rPr>
         <w:t xml:space="preserve">  ·  </w:t>
       </w:r>
-      <w:hyperlink w:history="1" r:id="rIdyd764aj7hrmwi4ucs3nyg">
+      <w:hyperlink w:history="1" r:id="rIdnfhpdi4q4bu8g3okzyx38">
         <w:r>
           <w:rPr>
             <w:rFonts w:ascii="Arial" w:cs="Arial" w:eastAsia="Arial" w:hAnsi="Arial"/>
@@ -850,7 +850,7 @@
           <w:rFonts w:ascii="Arial" w:cs="Arial" w:eastAsia="Arial" w:hAnsi="Arial"/>
           <w:color w:val="111111"/>
         </w:rPr>
-        <w:t xml:space="preserve">Azure (hands-on, DevOps CI/CD), Vercel (production), Firebase, Supabase. AWS &amp; GCP — academic, with the VAISS AWS deployment in flight as a hands-on learning project. CI/CD via Azure DevOps and GitHub Actions. Docker basics.</w:t>
+        <w:t xml:space="preserve">Azure (hands-on, DevOps CI/CD), Vercel (production), Firebase, Supabase. AWS — Certified AI Practitioner, with the VAISS AWS deployment in flight as a hands-on learning project. GCP — academic. CI/CD via Azure DevOps and GitHub Actions. Docker basics.</w:t>
       </w:r>
     </w:p>
     <w:p>
@@ -1154,7 +1154,7 @@
           <w:rFonts w:ascii="Arial" w:cs="Arial" w:eastAsia="Arial" w:hAnsi="Arial"/>
           <w:color w:val="111111"/>
         </w:rPr>
-        <w:t xml:space="preserve">AWS AI Practitioner &amp; Solutions Architect Associate — actively studying</w:t>
+        <w:t xml:space="preserve">AWS Certified AI Practitioner (certified) · AWS Solutions Architect Associate — in progress</w:t>
       </w:r>
     </w:p>
     <w:p>

</xml_diff>